<commit_message>
revised methods word doc
</commit_message>
<xml_diff>
--- a/Materials/AI_Website_Methods.docx
+++ b/Materials/AI_Website_Methods.docx
@@ -4252,6 +4252,9 @@
             <m:t>)</m:t>
           </m:r>
           <m:r>
+            <m:rPr>
+              <m:sty m:val="p"/>
+            </m:rPr>
             <w:br/>
           </m:r>
         </m:oMath>
@@ -5156,6 +5159,76 @@
         <w:t>These datasets are merged at the occupation level, allowing the system to generate transition pathways and associated training opportunities.</w:t>
       </w:r>
     </w:p>
+    <w:p/>
+    <w:p/>
+    <w:p/>
+    <w:p/>
+    <w:p/>
+    <w:p/>
+    <w:p/>
+    <w:p/>
+    <w:p/>
+    <w:p/>
+    <w:p/>
+    <w:p/>
+    <w:p/>
+    <w:p>
+      <w:pPr>
+        <w:rPr>
+          <w:b/>
+          <w:bCs/>
+        </w:rPr>
+      </w:pPr>
+      <w:r>
+        <w:rPr>
+          <w:b/>
+          <w:bCs/>
+        </w:rPr>
+        <w:lastRenderedPageBreak/>
+        <w:t xml:space="preserve">Other </w:t>
+      </w:r>
+    </w:p>
+    <w:p>
+      <w:r>
+        <w:t xml:space="preserve">X, Y, Z skills were defined by the </w:t>
+      </w:r>
+      <w:r>
+        <w:t>O*NET database</w:t>
+      </w:r>
+      <w:r>
+        <w:t xml:space="preserve">, which includes a </w:t>
+      </w:r>
+      <w:r>
+        <w:t xml:space="preserve">rich set of variables that describe work and worker characteristics, including skill requirements. Developers and other customers are encouraged to incorporate the O*NET database within their products, services, and research. </w:t>
+      </w:r>
+      <w:r>
+        <w:t>(ONET)</w:t>
+      </w:r>
+    </w:p>
+    <w:p>
+      <w:pPr>
+        <w:pStyle w:val="ListParagraph"/>
+        <w:numPr>
+          <w:ilvl w:val="1"/>
+          <w:numId w:val="12"/>
+        </w:numPr>
+      </w:pPr>
+      <w:hyperlink r:id="rId12" w:history="1">
+        <w:r>
+          <w:rPr>
+            <w:rStyle w:val="Hyperlink"/>
+          </w:rPr>
+          <w:t>https://www.onetcenter.org/database.html#all-files</w:t>
+        </w:r>
+      </w:hyperlink>
+      <w:r>
+        <w:t xml:space="preserve"> </w:t>
+      </w:r>
+    </w:p>
+    <w:p/>
+    <w:p/>
+    <w:p/>
+    <w:p/>
     <w:sectPr>
       <w:pgSz w:w="12240" w:h="15840"/>
       <w:pgMar w:top="1440" w:right="1440" w:bottom="1440" w:left="1440" w:header="720" w:footer="720" w:gutter="0"/>
@@ -6104,7 +6177,7 @@
   <w:abstractNum w:abstractNumId="9" w15:restartNumberingAfterBreak="0">
     <w:nsid w:val="409005AA"/>
     <w:multiLevelType w:val="multilevel"/>
-    <w:tmpl w:val="F072C48C"/>
+    <w:tmpl w:val="2592A65A"/>
     <w:lvl w:ilvl="0">
       <w:start w:val="1"/>
       <w:numFmt w:val="bullet"/>
@@ -6121,20 +6194,16 @@
         <w:sz w:val="20"/>
       </w:rPr>
     </w:lvl>
-    <w:lvl w:ilvl="1" w:tentative="1">
-      <w:start w:val="1"/>
-      <w:numFmt w:val="bullet"/>
-      <w:lvlText w:val="o"/>
-      <w:lvlJc w:val="left"/>
-      <w:pPr>
-        <w:tabs>
-          <w:tab w:val="num" w:pos="1440"/>
-        </w:tabs>
+    <w:lvl w:ilvl="1">
+      <w:start w:val="1"/>
+      <w:numFmt w:val="decimal"/>
+      <w:lvlText w:val="%2."/>
+      <w:lvlJc w:val="left"/>
+      <w:pPr>
         <w:ind w:left="1440" w:hanging="360"/>
       </w:pPr>
       <w:rPr>
-        <w:rFonts w:ascii="Courier New" w:hAnsi="Courier New" w:hint="default"/>
-        <w:sz w:val="20"/>
+        <w:rFonts w:hint="default"/>
       </w:rPr>
     </w:lvl>
     <w:lvl w:ilvl="2" w:tentative="1">
@@ -7896,7 +7965,6 @@
     <w:name w:val="Hyperlink"/>
     <w:basedOn w:val="DefaultParagraphFont"/>
     <w:uiPriority w:val="99"/>
-    <w:semiHidden/>
     <w:unhideWhenUsed/>
     <w:rsid w:val="00AE3DC0"/>
     <w:rPr>
@@ -7939,6 +8007,18 @@
     <w:name w:val="whitespace-normal"/>
     <w:basedOn w:val="DefaultParagraphFont"/>
     <w:rsid w:val="00AE3DC0"/>
+  </w:style>
+  <w:style w:type="character" w:styleId="UnresolvedMention">
+    <w:name w:val="Unresolved Mention"/>
+    <w:basedOn w:val="DefaultParagraphFont"/>
+    <w:uiPriority w:val="99"/>
+    <w:semiHidden/>
+    <w:unhideWhenUsed/>
+    <w:rsid w:val="00EF6D78"/>
+    <w:rPr>
+      <w:color w:val="605E5C"/>
+      <w:shd w:val="clear" w:color="auto" w:fill="E1DFDD"/>
+    </w:rPr>
   </w:style>
 </w:styles>
 </file>

</xml_diff>